<commit_message>
Describe the third coder
Co-Authored-By: Claude Sonnet 5.5 <noreply@anthropic.com>
Claude-Session: https://claude.ai/code/session_011aZmoPyuUT34TyBPwawaPZ
</commit_message>
<xml_diff>
--- a/misq_note/hf/MANUSCRIPT_MISQ_v6.docx
+++ b/misq_note/hf/MANUSCRIPT_MISQ_v6.docx
@@ -301,7 +301,7 @@
         <w:t xml:space="preserve"> </w:t>
       </w:r>
       <w:r>
-        <w:t xml:space="preserve">Two human coders labelled the posts independently from the text alone in three rounds (Section 4.3), and agreement is reported as Cohen’s (1960) kappa. Disagreements were first adjudicated from the text by the lead investigator, who knew the research question; 23.6% of all final labels, and 66% of the final escalation labels, are adjudicated (11% of the de-escalation labels). Because that is a researcher’s judgement, a third coder who did not know the research question or any market result and had not seen the earlier labels afterwards labelled the 45 items on which the two coders had disagreed, mixed with 15 items on which they had agreed, in random order, text only [describe the third coder]; the plan was written before the sheet was sent (Section 4.5). We report the investigator-adjudicated labels, the labels in which the majority of the two coders and the third coder decides (</w:t>
+        <w:t xml:space="preserve">Two human coders labelled the posts independently from the text alone in three rounds (Section 4.3), and agreement is reported as Cohen’s (1960) kappa. Disagreements were first adjudicated from the text by the lead investigator, who knew the research question; 23.6% of all final labels, and 66% of the final escalation labels, are adjudicated (11% of the de-escalation labels). Because that is a researcher’s judgement, a third coder who did not know the research question or any market result and had not seen the earlier labels afterwards labelled the 45 items on which the two coders had disagreed, mixed with 15 items on which they had agreed, in random order, text only; the third coder was a third-year undergraduate student of computer science at Hanyang University, knowledgeable about computing but without training in information systems, who remembered the event [confirm that the third coder was not told the research question]; the plan was written before the sheet was sent (Section 4.5). We report the investigator-adjudicated labels, the labels in which the majority of the two coders and the third coder decides (</w:t>
       </w:r>
       <w:r>
         <w:t xml:space="preserve">“</w:t>
@@ -3514,7 +3514,7 @@
         <w:pStyle w:val="FirstParagraph"/>
       </w:pPr>
       <w:r>
-        <w:t xml:space="preserve">The identification is weak. Posts follow volatile hours, all 20 cases examined in market-wire coverage show other drivers, and the pre-post drift is as large as the post move over windows of 30 minutes and longer; the tick analysis separates them only at 5 to 15 minutes, on 29 and 16 events from one conflict, one sender and one asset (a dealer CFD quote feed, not exchange futures, with contract roll and timestamp alignment not tested). The placebos are matched on clock hour, weekday and preceding drift but not on news. Three events supply 54% of the de-escalation mean, 83% of signal posts without a market window were made on weekends or off-hours, and 48% of escalation signal posts are lost for that reason against 22% of de-escalation posts, so the two classes are selected differently. The investigator who first adjudicated the coders’ disagreements knew the hypotheses and decided 66% of the escalation labels; an independent third coder, who is a noisy rater (κ = 0.45 on control items), changed 24 final labels and left the escalation estimate on 10 events. The two coders did not know the hypotheses and had no interest in oil prices, but they are from the authors’ department and remembered the course of the war. The human coders agree at κ = 0.51 to 0.69, so human labels are a benchmark, not truth. The model comparison uses instances of one vendor’s model family under one codebook; the first-stage model is not documented to the level of version and temperature, and no other family, few-shot or reasoning variant was run. The decision rule for a prompt explanation (κ ≥ 0.60 and escalation precision ≥ 0.70) was set by us, and the humans themselves reach 0.61 to 0.69. The label-set contrasts are not corrected for multiplicity. The primary sample was redefined three times after seeing label quality and outcomes, the plans are not an independent registry, and the windows we rely on were chosen after seeing them. The arrival-process, event-explanation and information-theoretic analyses were run after, or are independent of, the labelling question and are exploratory or low-powered (Appendices D to F).</w:t>
+        <w:t xml:space="preserve">The identification is weak. Posts follow volatile hours, all 20 cases examined in market-wire coverage show other drivers, and the pre-post drift is as large as the post move over windows of 30 minutes and longer; the tick analysis separates them only at 5 to 15 minutes, on 29 and 16 events from one conflict, one sender and one asset (a dealer CFD quote feed, not exchange futures, with contract roll and timestamp alignment not tested). The placebos are matched on clock hour, weekday and preceding drift but not on news. Three events supply 54% of the de-escalation mean, 83% of signal posts without a market window were made on weekends or off-hours, and 48% of escalation signal posts are lost for that reason against 22% of de-escalation posts, so the two classes are selected differently. The investigator who first adjudicated the coders’ disagreements knew the hypotheses and decided 66% of the escalation labels; an independent third coder, an undergraduate computer-science student without information-systems training and a noisy rater (κ = 0.45 on control items), changed 24 final labels and left the escalation estimate on 10 events. The two coders did not know the hypotheses and had no interest in oil prices, but they are from the authors’ department and remembered the course of the war. The human coders agree at κ = 0.51 to 0.69, so human labels are a benchmark, not truth. The model comparison uses instances of one vendor’s model family under one codebook; the first-stage model is not documented to the level of version and temperature, and no other family, few-shot or reasoning variant was run. The decision rule for a prompt explanation (κ ≥ 0.60 and escalation precision ≥ 0.70) was set by us, and the humans themselves reach 0.61 to 0.69. The label-set contrasts are not corrected for multiplicity. The primary sample was redefined three times after seeing label quality and outcomes, the plans are not an independent registry, and the windows we rely on were chosen after seeing them. The arrival-process, event-explanation and information-theoretic analyses were run after, or are independent of, the labelling question and are exploratory or low-powered (Appendices D to F).</w:t>
       </w:r>
     </w:p>
     <w:bookmarkEnd w:id="45"/>
@@ -6293,7 +6293,7 @@
         <w:t xml:space="preserve">”</w:t>
       </w:r>
       <w:r>
-        <w:t xml:space="preserve">). Items were in a different random order for each coder in round 2. Each item also received a confidence rating (1 = clear, 2 = somewhat unclear). The coders did not know the research question. Disagreements were adjudicated by the lead investigator from the text alone, without market information; a post for which no resolution was reached would have been excluded (sensitivity: treated as mixed).</w:t>
+        <w:t xml:space="preserve">). Items were in a different random order for each coder in round 2. Each item also received a confidence rating (1 = clear, 2 = somewhat unclear). The coders did not know the research question. A third coder, a third-year undergraduate computer-science student, later coded the 45 disputed items and 15 control items in random order from a separate sheet with the same codebook and instructions (Section 4.5). Disagreements were adjudicated by the lead investigator from the text alone, without market information; a post for which no resolution was reached would have been excluded (sensitivity: treated as mixed).</w:t>
       </w:r>
     </w:p>
     <w:p>

</xml_diff>